<commit_message>
feat: Update on week 1 of the JWT exercises (2nd week)
</commit_message>
<xml_diff>
--- a/22705671_BuiKhanhLan_Buoi1.docx
+++ b/22705671_BuiKhanhLan_Buoi1.docx
@@ -563,24 +563,7 @@
         </w:numPr>
       </w:pPr>
       <w:r>
-        <w:rPr>
-          <w:b/>
-          <w:bCs/>
-        </w:rPr>
-        <w:t>Quyết định:</w:t>
-      </w:r>
-      <w:r>
-        <w:t xml:space="preserve"> Sử dụng </w:t>
-      </w:r>
-      <w:r>
-        <w:rPr>
-          <w:b/>
-          <w:bCs/>
-        </w:rPr>
-        <w:t>PostgreSQL (RDBMS)</w:t>
-      </w:r>
-      <w:r>
-        <w:t xml:space="preserve"> làm database chính.</w:t>
+        <w:t>Quyết định: Sử dụng PostgreSQL (RDBMS) làm database chính.</w:t>
       </w:r>
     </w:p>
     <w:p>
@@ -591,24 +574,7 @@
         </w:numPr>
       </w:pPr>
       <w:r>
-        <w:rPr>
-          <w:b/>
-          <w:bCs/>
-        </w:rPr>
-        <w:t>Trade-off:</w:t>
-      </w:r>
-      <w:r>
-        <w:t xml:space="preserve"> * </w:t>
-      </w:r>
-      <w:r>
-        <w:rPr>
-          <w:b/>
-          <w:bCs/>
-        </w:rPr>
-        <w:t>Được:</w:t>
-      </w:r>
-      <w:r>
-        <w:t xml:space="preserve"> Đảm bảo tính nhất quán dữ liệu (ACID) tuyệt đối cho đơn hàng và kho vận.</w:t>
+        <w:t>Trade-off: * Được: Đảm bảo tính nhất quán dữ liệu (ACID) tuyệt đối cho đơn hàng và kho vận.</w:t>
       </w:r>
     </w:p>
     <w:p>
@@ -619,14 +585,7 @@
         </w:numPr>
       </w:pPr>
       <w:r>
-        <w:rPr>
-          <w:b/>
-          <w:bCs/>
-        </w:rPr>
-        <w:t>Mất:</w:t>
-      </w:r>
-      <w:r>
-        <w:t xml:space="preserve"> Khó mở rộng theo chiều ngang (Horizontal Scaling) hơn so với NoSQL.</w:t>
+        <w:t>Mất: Khó mở rộng theo chiều ngang (Horizontal Scaling) hơn so với NoSQL.</w:t>
       </w:r>
     </w:p>
     <w:p>
@@ -637,14 +596,7 @@
         </w:numPr>
       </w:pPr>
       <w:r>
-        <w:rPr>
-          <w:b/>
-          <w:bCs/>
-        </w:rPr>
-        <w:t>Lý do:</w:t>
-      </w:r>
-      <w:r>
-        <w:t xml:space="preserve"> Với E-commerce mini, tính chính xác của dữ liệu quan trọng hơn việc xử lý hàng tỷ record ngay lập tức.</w:t>
+        <w:t>Lý do: Với E-commerce mini, tính chính xác của dữ liệu quan trọng hơn việc xử lý hàng tỷ record ngay lập tức.</w:t>
       </w:r>
     </w:p>
     <w:p>
@@ -670,24 +622,7 @@
         </w:numPr>
       </w:pPr>
       <w:r>
-        <w:rPr>
-          <w:b/>
-          <w:bCs/>
-        </w:rPr>
-        <w:t>Quyết định:</w:t>
-      </w:r>
-      <w:r>
-        <w:t xml:space="preserve"> Sử dụng </w:t>
-      </w:r>
-      <w:r>
-        <w:rPr>
-          <w:b/>
-          <w:bCs/>
-        </w:rPr>
-        <w:t>Asynchronous Communication (Message Queue)</w:t>
-      </w:r>
-      <w:r>
-        <w:t xml:space="preserve"> cho tiến trình đặt hàng.</w:t>
+        <w:t>Quyết định: Sử dụng Asynchronous Communication (Message Queue) cho tiến trình đặt hàng.</w:t>
       </w:r>
     </w:p>
     <w:p>
@@ -698,24 +633,7 @@
         </w:numPr>
       </w:pPr>
       <w:r>
-        <w:rPr>
-          <w:b/>
-          <w:bCs/>
-        </w:rPr>
-        <w:t>Trade-off:</w:t>
-      </w:r>
-      <w:r>
-        <w:t xml:space="preserve"> * </w:t>
-      </w:r>
-      <w:r>
-        <w:rPr>
-          <w:b/>
-          <w:bCs/>
-        </w:rPr>
-        <w:t>Được:</w:t>
-      </w:r>
-      <w:r>
-        <w:t xml:space="preserve"> Tăng Performance và Scalability. Khách hàng không phải chờ hệ thống gọi sang bên vận chuyển/email rồi mới nhận thông báo thành công.</w:t>
+        <w:t>Trade-off: * Được: Tăng Performance và Scalability. Khách hàng không phải chờ hệ thống gọi sang bên vận chuyển/email rồi mới nhận thông báo thành công.</w:t>
       </w:r>
     </w:p>
     <w:p>
@@ -726,14 +644,7 @@
         </w:numPr>
       </w:pPr>
       <w:r>
-        <w:rPr>
-          <w:b/>
-          <w:bCs/>
-        </w:rPr>
-        <w:t>Mất:</w:t>
-      </w:r>
-      <w:r>
-        <w:t xml:space="preserve"> Tăng độ phức tạp của hệ thống (phải quản lý thêm Kafka/RabbitMQ) và đối mặt với bài toán "Eventual Consistency".</w:t>
+        <w:t>Mất: Tăng độ phức tạp của hệ thống (phải quản lý thêm Kafka/RabbitMQ) và đối mặt với bài toán "Eventual Consistency".</w:t>
       </w:r>
     </w:p>
     <w:p>
@@ -744,14 +655,7 @@
         </w:numPr>
       </w:pPr>
       <w:r>
-        <w:rPr>
-          <w:b/>
-          <w:bCs/>
-        </w:rPr>
-        <w:t>Lý do:</w:t>
-      </w:r>
-      <w:r>
-        <w:t xml:space="preserve"> Giúp hệ thống chịu tải tốt hơn khi có nhiều đơn hàng cùng lúc.</w:t>
+        <w:t>Lý do: Giúp hệ thống chịu tải tốt hơn khi có nhiều đơn hàng cùng lúc.</w:t>
       </w:r>
     </w:p>
     <w:p>

</xml_diff>